<commit_message>
Upload bài thực hành buổi 3
</commit_message>
<xml_diff>
--- a/Lê Thị Anh Thư_1150070042_11TMĐT_LAB2.docx
+++ b/Lê Thị Anh Thư_1150070042_11TMĐT_LAB2.docx
@@ -24,6 +24,14 @@
       </w:pPr>
       <w:r>
         <w:t>MSSV: 1150070042</w:t>
+      </w:r>
+    </w:p>
+    <w:p>
+      <w:pPr>
+        <w:spacing w:line="360" w:lineRule="auto"/>
+      </w:pPr>
+      <w:r>
+        <w:t>Số máy: 06</w:t>
       </w:r>
     </w:p>
     <w:p>
@@ -198,71 +206,54 @@
           <w:b/>
           <w:bCs/>
         </w:rPr>
-        <w:t>I. Xây dựng Giao diện</w:t>
-      </w:r>
-      <w:r>
+        <w:t>I. Xây dựng Giao diện.</w:t>
+      </w:r>
+    </w:p>
+    <w:p>
+      <w:pPr>
+        <w:spacing w:line="360" w:lineRule="auto"/>
         <w:rPr>
           <w:b/>
           <w:bCs/>
         </w:rPr>
-        <w:t>.</w:t>
+      </w:pPr>
+      <w:r>
+        <w:rPr>
+          <w:b/>
+          <w:bCs/>
+        </w:rPr>
+        <w:t>Bước 1: Chuẩn bị Tài nguyên (Resources)</w:t>
       </w:r>
     </w:p>
     <w:p>
       <w:pPr>
         <w:spacing w:line="360" w:lineRule="auto"/>
+      </w:pPr>
+      <w:r>
+        <w:t>Tạo và chỉnh sửa các tệp trong thư mục </w:t>
+      </w:r>
+      <w:r>
         <w:rPr>
           <w:b/>
           <w:bCs/>
         </w:rPr>
-      </w:pPr>
-      <w:r>
+        <w:t>res/values/:</w:t>
+      </w:r>
+    </w:p>
+    <w:p>
+      <w:pPr>
+        <w:spacing w:line="360" w:lineRule="auto"/>
         <w:rPr>
           <w:b/>
           <w:bCs/>
         </w:rPr>
-        <w:t>Bước 1: Chuẩn bị Tài nguyên (Resources)</w:t>
-      </w:r>
-    </w:p>
-    <w:p>
-      <w:pPr>
-        <w:spacing w:line="360" w:lineRule="auto"/>
-      </w:pPr>
-      <w:r>
-        <w:t>T</w:t>
-      </w:r>
-      <w:r>
-        <w:t>ạo và chỉnh sửa các tệp trong thư mục </w:t>
-      </w:r>
+      </w:pPr>
       <w:r>
         <w:rPr>
           <w:b/>
           <w:bCs/>
         </w:rPr>
-        <w:t>res/values/:</w:t>
-      </w:r>
-    </w:p>
-    <w:p>
-      <w:pPr>
-        <w:spacing w:line="360" w:lineRule="auto"/>
-        <w:rPr>
-          <w:b/>
-          <w:bCs/>
-        </w:rPr>
-      </w:pPr>
-      <w:r>
-        <w:rPr>
-          <w:b/>
-          <w:bCs/>
-        </w:rPr>
-        <w:t>File res/values/colors.xml</w:t>
-      </w:r>
-      <w:r>
-        <w:rPr>
-          <w:b/>
-          <w:bCs/>
-        </w:rPr>
-        <w:t>:</w:t>
+        <w:t>File res/values/colors.xml:</w:t>
       </w:r>
     </w:p>
     <w:p>
@@ -3222,10 +3213,7 @@
       </w:pPr>
       <w:r>
         <w:lastRenderedPageBreak/>
-        <w:t>T</w:t>
-      </w:r>
-      <w:r>
-        <w:t xml:space="preserve">ạo file Java mới tên là </w:t>
+        <w:t xml:space="preserve">Tạo file Java mới tên là </w:t>
       </w:r>
       <w:r>
         <w:rPr>
@@ -3246,16 +3234,7 @@
           <w:sz w:val="26"/>
           <w:szCs w:val="26"/>
         </w:rPr>
-        <w:t>MainActivity</w:t>
-      </w:r>
-      <w:r>
-        <w:rPr>
-          <w:rStyle w:val="HTMLCode"/>
-          <w:rFonts w:ascii="Times New Roman" w:eastAsiaTheme="majorEastAsia" w:hAnsi="Times New Roman" w:cs="Times New Roman"/>
-          <w:sz w:val="26"/>
-          <w:szCs w:val="26"/>
-        </w:rPr>
-        <w:t>.</w:t>
+        <w:t>MainActivity.</w:t>
       </w:r>
     </w:p>
     <w:p>
@@ -5309,10 +5288,7 @@
         <w:spacing w:line="360" w:lineRule="auto"/>
       </w:pPr>
       <w:r>
-        <w:t>Yêu cầu: Trong bài luyện tập 1 (Ứng dụng Truyện Cười), viết code cho phép xoay ngang hoặc không. Khi người dùng nhấn Off thì không cho quay ngang màn hình</w:t>
-      </w:r>
-      <w:r>
-        <w:t>.</w:t>
+        <w:t>Yêu cầu: Trong bài luyện tập 1 (Ứng dụng Truyện Cười), viết code cho phép xoay ngang hoặc không. Khi người dùng nhấn Off thì không cho quay ngang màn hình.</w:t>
       </w:r>
     </w:p>
     <w:p>
@@ -5337,16 +5313,24 @@
           <w:sz w:val="26"/>
           <w:szCs w:val="26"/>
         </w:rPr>
-        <w:t>Chuẩn bị (Cấu hình và Tài nguyên)</w:t>
-      </w:r>
-      <w:r>
+        <w:t>Chuẩn bị (Cấu hình và Tài nguyên):</w:t>
+      </w:r>
+    </w:p>
+    <w:p>
+      <w:pPr>
+        <w:spacing w:line="360" w:lineRule="auto"/>
         <w:rPr>
           <w:b/>
           <w:bCs/>
-          <w:sz w:val="26"/>
-          <w:szCs w:val="26"/>
-        </w:rPr>
-        <w:t>:</w:t>
+        </w:rPr>
+      </w:pPr>
+      <w:r>
+        <w:rPr>
+          <w:b/>
+          <w:bCs/>
+        </w:rPr>
+        <w:lastRenderedPageBreak/>
+        <w:t>Cấu hình AndroidManifest.xml</w:t>
       </w:r>
     </w:p>
     <w:p>
@@ -5358,38 +5342,14 @@
         </w:rPr>
       </w:pPr>
       <w:r>
+        <w:t xml:space="preserve">Để Activity có thể tự điều khiển hướng xoay bằng code Java, cần đảm bảo thẻ &lt;activity&gt; KHÔNG CÓ thuộc tính </w:t>
+      </w:r>
+      <w:r>
         <w:rPr>
           <w:b/>
           <w:bCs/>
         </w:rPr>
-        <w:lastRenderedPageBreak/>
-        <w:t>Cấu hình AndroidManifest.xml</w:t>
-      </w:r>
-    </w:p>
-    <w:p>
-      <w:pPr>
-        <w:spacing w:line="360" w:lineRule="auto"/>
-        <w:rPr>
-          <w:b/>
-          <w:bCs/>
-        </w:rPr>
-      </w:pPr>
-      <w:r>
-        <w:t xml:space="preserve">Để Activity có thể tự điều khiển hướng xoay bằng code Java, cần đảm bảo thẻ &lt;activity&gt; KHÔNG CÓ thuộc tính </w:t>
-      </w:r>
-      <w:r>
-        <w:rPr>
-          <w:b/>
-          <w:bCs/>
-        </w:rPr>
-        <w:t>android:configChanges</w:t>
-      </w:r>
-      <w:r>
-        <w:rPr>
-          <w:b/>
-          <w:bCs/>
-        </w:rPr>
-        <w:t>.</w:t>
+        <w:t>android:configChanges.</w:t>
       </w:r>
     </w:p>
     <w:p>
@@ -6837,13 +6797,7 @@
         <w:spacing w:line="360" w:lineRule="auto"/>
       </w:pPr>
       <w:r>
-        <w:t>Khai báo biến</w:t>
-      </w:r>
-      <w:r>
-        <w:t xml:space="preserve">: </w:t>
-      </w:r>
-      <w:r>
-        <w:t>private boolean isRotationEnabled = true;</w:t>
+        <w:t>Khai báo biến: private boolean isRotationEnabled = true;</w:t>
       </w:r>
     </w:p>
     <w:p>
@@ -6857,13 +6811,7 @@
         <w:jc w:val="left"/>
       </w:pPr>
       <w:r>
-        <w:t>Hàm Getter</w:t>
-      </w:r>
-      <w:r>
-        <w:t xml:space="preserve">: </w:t>
-      </w:r>
-      <w:r>
-        <w:t>java public boolean isRotationEnabled() { return isRotationEnabled; }</w:t>
+        <w:t>Hàm Getter: java public boolean isRotationEnabled() { return isRotationEnabled; }</w:t>
       </w:r>
     </w:p>
     <w:p>
@@ -6877,13 +6825,7 @@
         <w:jc w:val="left"/>
       </w:pPr>
       <w:r>
-        <w:t>onCreate()</w:t>
-      </w:r>
-      <w:r>
-        <w:t xml:space="preserve">: </w:t>
-      </w:r>
-      <w:r>
-        <w:t>Gọi hàm thiết lập trạng thái ban đầu: toggleRotation(isRotationEnabled);</w:t>
+        <w:t>onCreate(): Gọi hàm thiết lập trạng thái ban đầu: toggleRotation(isRotationEnabled);</w:t>
       </w:r>
     </w:p>
     <w:p>
@@ -13016,14 +12958,7 @@
           <w:b/>
           <w:bCs/>
         </w:rPr>
-        <w:t xml:space="preserve">1. </w:t>
-      </w:r>
-      <w:r>
-        <w:rPr>
-          <w:b/>
-          <w:bCs/>
-        </w:rPr>
-        <w:t>Cập nhật MainActivity.java (Thêm Menu và Logic Ngôn ngữ)</w:t>
+        <w:t>1. Cập nhật MainActivity.java (Thêm Menu và Logic Ngôn ngữ)</w:t>
       </w:r>
     </w:p>
     <w:p>
@@ -19448,6 +19383,7 @@
   <w:style w:type="character" w:default="1" w:styleId="DefaultParagraphFont">
     <w:name w:val="Default Paragraph Font"/>
     <w:uiPriority w:val="1"/>
+    <w:semiHidden/>
     <w:unhideWhenUsed/>
   </w:style>
   <w:style w:type="table" w:default="1" w:styleId="TableNormal">

</xml_diff>